<commit_message>
archivo plantilla de entrega
</commit_message>
<xml_diff>
--- a/ADA2_Equipo7/E7_ADA2_ApellidoNombre.docx
+++ b/ADA2_Equipo7/E7_ADA2_ApellidoNombre.docx
@@ -276,6 +276,16 @@
         </w:rPr>
         <w:t xml:space="preserve">Enlace de carpeta: </w:t>
       </w:r>
+    </w:p>
+    <w:p>
+      <w:hyperlink r:id="rId5" w:history="1">
+        <w:r>
+          <w:rPr>
+            <w:rStyle w:val="Hipervnculo"/>
+          </w:rPr>
+          <w:t>https://github.com/leoojedauady/Equipo7ConstruccionSoftware/tree/main/ADA2_Equipo7</w:t>
+        </w:r>
+      </w:hyperlink>
     </w:p>
     <w:p>
       <w:bookmarkStart w:id="0" w:name="_GoBack"/>

</xml_diff>